<commit_message>
audit follow-ups: notebook version stamps, rollup PR note, platform tech doc
</commit_message>
<xml_diff>
--- a/docs/EnergyLens_Platform_Technical_Documentation.docx
+++ b/docs/EnergyLens_Platform_Technical_Documentation.docx
@@ -3137,7 +3137,7 @@
         <w:t xml:space="preserve">gold_solar_daily</w:t>
       </w:r>
       <w:r>
-        <w:t xml:space="preserve"> (loader: generation = counter-delta or power-trapezoid integration; IEC PR clamp; self-consumption = ∫min(PV, load)dt only when a load meter exists — inverter-only sites get </w:t>
+        <w:t xml:space="preserve"> (loader: generation = counter-delta or power-trapezoid integration with a 6-h gap guard; IEC PR NULL below 0.05 kWh/m² irradiation and clamped ≤ 1.1 — deliberately looser than the synthetic gold's 0.95 because a real POA sensor can read PR &gt; 1.0 on cold clear days; self-consumption = ∫min(PV, load)dt only when a load meter exists — inverter-only sites get </w:t>
       </w:r>
       <w:r>
         <w:rPr>
@@ -7240,6 +7240,99 @@
       </w:r>
       <w:r>
         <w:t xml:space="preserve"> gitignored.</w:t>
+      </w:r>
+    </w:p>
+    <w:p>
+      <w:pPr>
+        <w:pStyle w:val="ListParagraph"/>
+        <w:numPr>
+          <w:ilvl w:val="0"/>
+          <w:numId w:val="4"/>
+        </w:numPr>
+        <w:spacing w:after="60"/>
+      </w:pPr>
+      <w:r>
+        <w:rPr>
+          <w:b/>
+          <w:bCs/>
+        </w:rPr>
+        <w:t xml:space="preserve">Vercel production build repaired</w:t>
+      </w:r>
+      <w:r>
+        <w:t xml:space="preserve"> (broken since 1bbfbe2, 06-29): </w:t>
+      </w:r>
+      <w:r>
+        <w:rPr>
+          <w:rFonts w:ascii="Consolas" w:cs="Consolas" w:eastAsia="Consolas" w:hAnsi="Consolas"/>
+          <w:color w:val="0F6E56"/>
+          <w:sz w:val="18"/>
+          <w:szCs w:val="18"/>
+        </w:rPr>
+        <w:t xml:space="preserve">PartialYearNotice</w:t>
+      </w:r>
+      <w:r>
+        <w:t xml:space="preserve"> was imported from </w:t>
+      </w:r>
+      <w:r>
+        <w:rPr>
+          <w:rFonts w:ascii="Consolas" w:cs="Consolas" w:eastAsia="Consolas" w:hAnsi="Consolas"/>
+          <w:color w:val="0F6E56"/>
+          <w:sz w:val="18"/>
+          <w:szCs w:val="18"/>
+        </w:rPr>
+        <w:t xml:space="preserve">@/lib/crrem</w:t>
+      </w:r>
+      <w:r>
+        <w:t xml:space="preserve"> instead of </w:t>
+      </w:r>
+      <w:r>
+        <w:rPr>
+          <w:rFonts w:ascii="Consolas" w:cs="Consolas" w:eastAsia="Consolas" w:hAnsi="Consolas"/>
+          <w:color w:val="0F6E56"/>
+          <w:sz w:val="18"/>
+          <w:szCs w:val="18"/>
+        </w:rPr>
+        <w:t xml:space="preserve">./reportKit</w:t>
+      </w:r>
+      <w:r>
+        <w:t xml:space="preserve"> in the ESRS-E1 and VSME report documents; fixed, </w:t>
+      </w:r>
+      <w:r>
+        <w:rPr>
+          <w:rFonts w:ascii="Consolas" w:cs="Consolas" w:eastAsia="Consolas" w:hAnsi="Consolas"/>
+          <w:color w:val="0F6E56"/>
+          <w:sz w:val="18"/>
+          <w:szCs w:val="18"/>
+        </w:rPr>
+        <w:t xml:space="preserve">tsc --noEmit</w:t>
+      </w:r>
+      <w:r>
+        <w:t xml:space="preserve"> clean, deploy </w:t>
+      </w:r>
+      <w:r>
+        <w:rPr>
+          <w:rFonts w:ascii="Consolas" w:cs="Consolas" w:eastAsia="Consolas" w:hAnsi="Consolas"/>
+          <w:color w:val="0F6E56"/>
+          <w:sz w:val="18"/>
+          <w:szCs w:val="18"/>
+        </w:rPr>
+        <w:t xml:space="preserve">ea0a825</w:t>
+      </w:r>
+      <w:r>
+        <w:t xml:space="preserve"> Ready in Production.</w:t>
+      </w:r>
+    </w:p>
+    <w:p>
+      <w:pPr>
+        <w:pStyle w:val="ListParagraph"/>
+        <w:numPr>
+          <w:ilvl w:val="0"/>
+          <w:numId w:val="4"/>
+        </w:numPr>
+        <w:spacing w:after="60"/>
+      </w:pPr>
+      <w:r>
+        <w:t xml:space="preserve">Ingest/SCADA pass (post-doc audit): telemetry rollup's stale "same cap as 03" comment corrected — measured-telemetry PR ceiling 1.1 (POA basis) is deliberate vs the synthetic gold's 0.95.</w:t>
       </w:r>
     </w:p>
     <w:p>

</xml_diff>

<commit_message>
docs: P1 closed - new rec engine verified live
</commit_message>
<xml_diff>
--- a/docs/EnergyLens_Platform_Technical_Documentation.docx
+++ b/docs/EnergyLens_Platform_Technical_Documentation.docx
@@ -1996,7 +1996,19 @@
         <w:spacing w:after="100"/>
       </w:pPr>
       <w:r>
-        <w:t xml:space="preserve">*(Uncommitted work-in-progress on 06, found in this audit: BMS-aware CapEx — re-commissioning €2.5/m² + €6k base when a BMS exists vs €28/m² new install; kWh/m² saving ceilings for BMS (20) and scheduling (15) so energy-dense types aren't over-credited; and a multi-year → 12-month annualisation fix for the consumption base. Compiles clean; needs commit + Fabric run — §8.)*</w:t>
+        <w:t xml:space="preserve">*(BMS-aware refinement, committed + verified live 2026-07-03: re-commissioning €2.5/m² + €6k base when a BMS exists vs €28/m² new install; kWh/m² saving ceilings for BMS (20) and scheduling (15) so energy-dense types aren't over-credited; and a multi-year → 12-month annualisation fix for the consumption base. CELL 0 prints an </w:t>
+      </w:r>
+      <w:r>
+        <w:rPr>
+          <w:rFonts w:ascii="Consolas" w:cs="Consolas" w:eastAsia="Consolas" w:hAnsi="Consolas"/>
+          <w:color w:val="0F6E56"/>
+          <w:sz w:val="18"/>
+          <w:szCs w:val="18"/>
+        </w:rPr>
+        <w:t xml:space="preserve">ENGINE_VERSION</w:t>
+      </w:r>
+      <w:r>
+        <w:t xml:space="preserve"> stamp so the run output itself proves which version executed.)*</w:t>
       </w:r>
     </w:p>
     <w:p>
@@ -7504,35 +7516,26 @@
           <w:p>
             <w:r>
               <w:rPr>
+                <w:sz w:val="19"/>
+                <w:szCs w:val="19"/>
+              </w:rPr>
+              <w:t xml:space="preserve">~~Fabric re-run in order: 03b → 06 → 06b → 50-materialize → PBI refresh.~~ </w:t>
+            </w:r>
+            <w:r>
+              <w:rPr>
                 <w:b/>
                 <w:bCs/>
                 <w:sz w:val="19"/>
                 <w:szCs w:val="19"/>
               </w:rPr>
-              <w:t xml:space="preserve">Fabric re-run in order: 03b → 06 → 06b → 50-materialize → PBI Service refresh.</w:t>
-            </w:r>
-            <w:r>
-              <w:rPr>
-                <w:sz w:val="19"/>
-                <w:szCs w:val="19"/>
-              </w:rPr>
-              <w:t xml:space="preserve"> Live </w:t>
-            </w:r>
-            <w:r>
-              <w:rPr>
-                <w:rFonts w:ascii="Consolas" w:cs="Consolas" w:eastAsia="Consolas" w:hAnsi="Consolas"/>
-                <w:color w:val="0F6E56"/>
-                <w:sz w:val="19"/>
-                <w:szCs w:val="19"/>
-              </w:rPr>
-              <w:t xml:space="preserve">mv_recommendations</w:t>
-            </w:r>
-            <w:r>
-              <w:rPr>
-                <w:sz w:val="19"/>
-                <w:szCs w:val="19"/>
-              </w:rPr>
-              <w:t xml:space="preserve"> is currently post-06/pre-06b (B007 battery 115.2 yr, B003 41.8 yr visible to SQL; app now guards, but the data must be re-calibrated). Commit the uncommitted 06 improvements (BMS-aware CapEx + annualisation + ceilings — compiles clean) first.</w:t>
+              <w:t xml:space="preserve">DONE 2026-07-03 evening</w:t>
+            </w:r>
+            <w:r>
+              <w:rPr>
+                <w:sz w:val="19"/>
+                <w:szCs w:val="19"/>
+              </w:rPr>
+              <w:t xml:space="preserve"> — verified live: BMS-aware CapEx formulas (28/15 €/m²) + annualised base in gold, 06b calibration applied (max payback 31.3, zero ≥40 rows, sub-metering 0, HP CO₂-guard), mirrored to Postgres 16:43. Capex forensics note: the BMS-aware engine had in fact been live since 06-29. Run one final PBI model refresh (post-16:43 write).</w:t>
             </w:r>
           </w:p>
         </w:tc>
@@ -7558,7 +7561,7 @@
                 <w:sz w:val="19"/>
                 <w:szCs w:val="19"/>
               </w:rPr>
-              <w:t xml:space="preserve">Mert (Fabric)</w:t>
+              <w:t xml:space="preserve">✓ done</w:t>
             </w:r>
           </w:p>
         </w:tc>

</xml_diff>